<commit_message>
VFX: aturdido más alto, Zona de verdad acostada, guía al día y se borra la herramienta del ojo
- GE_Stun y GE_OrderStun: el Target VFX sube a y = 1 (quedaba muy abajo).
- GA_ContinuousAoE y GA_InstantAoE instancian el VFX con la rotación del prefab
  en vez de cero: el de la Zona de verdad acuesta el círculo girando su raíz
  −90° en X y salía parado.
- Se borra MercEyeVfxSetup (VFX_EyeReveal ya está hecho).
- GAS_Guia: dónde va un VFX que dura un efecto (TargetVFX del GE) y
  TargetImpactAbility. PENDIENTES al día.

Co-Authored-By: Claude Opus 5.5 <noreply@anthropic.com>
</commit_message>
<xml_diff>
--- a/DesignDocuments/GAS_Guia_Crear_Habilidades.docx
+++ b/DesignDocuments/GAS_Guia_Crear_Habilidades.docx
@@ -4119,6 +4119,18 @@
               <w:t xml:space="preserve">Auras, destellos y estelas atadas al lanzamiento. Soporta varios VFX con delays, offsets y fin por tag.</w:t>
             </w:r>
           </w:p>
+          <w:p>
+            <w:pPr>
+              <w:spacing w:after="0"/>
+            </w:pPr>
+            <w:r>
+              <w:rPr>
+                <w:sz w:val="20"/>
+                <w:szCs w:val="20"/>
+              </w:rPr>
+              <w:t xml:space="preserve">Lo que tiene que durar lo que dura un buff o un debuff NO va acá: va en el TargetVFX del GE, que aparece pegado a quien lo recibe, se ve en todas las pantallas y se va cuando termina el efecto (con TargetVFXLoop, prendido por defecto, repite las partículas de los VFX de un solo disparo y al final se desvanece).</w:t>
+            </w:r>
+          </w:p>
         </w:tc>
         <w:tc>
           <w:tcPr>
@@ -4254,6 +4266,18 @@
                 <w:szCs w:val="20"/>
               </w:rPr>
               <w:t xml:space="preserve">Si el VFX tiene que seguir a un personaje: sobreescribí PlayImpactVFXOn(target) y llamá netAsc.ServerPlayAbilityVFXOn(this, target).</w:t>
+            </w:r>
+          </w:p>
+          <w:p>
+            <w:pPr>
+              <w:spacing w:after="0"/>
+            </w:pPr>
+            <w:r>
+              <w:rPr>
+                <w:sz w:val="20"/>
+                <w:szCs w:val="20"/>
+              </w:rPr>
+              <w:t xml:space="preserve">Mejor todavía: heredá de TargetImpactAbility en vez de GameplayAbility y llamá PlayImpactVFXOnTarget(objetivo). Ya trae ImpactVFX con Attach, Offset y Lifetime en el Inspector, y la red resuelta (así están GA_Target, GA_SwornEnemy, GA_CommandHalt, GA_MarkedForDeath, GA_Resurrection y GA_HeroicInterception).</w:t>
             </w:r>
           </w:p>
         </w:tc>

</xml_diff>

<commit_message>
Plantillas de invocación (Summon_Base, SummonZone_Base) y GA_SpawnSummon; guía paso a paso
- Prefabs/Summons/Summon_Base (con vida: ASDef_SummonBase, barra Nameplate, cápsula de muestra)
  y SummonZone_Base (solo zona: Summon_Zone de 4 m, 6 s), para hacer variantes.
- GA_SpawnSummon: habilidad genérica que pone una invocación donde apunta, a los pies o
  delante del lanzador, apoyada en el piso, con máximo a la vez.
- Entity_Summon: las invocaciones genéricas agrupan su límite por prefab, no por clase.
- Guía de habilidades 7.1: crear una invocación nueva en 10 pasos; GAS_Arquitectura,
  Glosario, Diseño de Clases, Red, CLAUDE.md y PENDIENTES al día.

Co-Authored-By: Claude Opus 5.5 <noreply@anthropic.com>
</commit_message>
<xml_diff>
--- a/DesignDocuments/GAS_Guia_Crear_Habilidades.docx
+++ b/DesignDocuments/GAS_Guia_Crear_Habilidades.docx
@@ -1617,6 +1617,78 @@
                 <w:sz w:val="20"/>
                 <w:szCs w:val="20"/>
               </w:rPr>
+              <w:t xml:space="preserve">GA_SpawnSummon</w:t>
+            </w:r>
+          </w:p>
+        </w:tc>
+        <w:tc>
+          <w:tcPr>
+            <w:tcW w:type="dxa" w:w="4600"/>
+            <w:tcMar>
+              <w:top w:type="dxa" w:w="60"/>
+              <w:left w:type="dxa" w:w="100"/>
+              <w:bottom w:type="dxa" w:w="60"/>
+              <w:right w:type="dxa" w:w="100"/>
+            </w:tcMar>
+          </w:tcPr>
+          <w:p>
+            <w:pPr>
+              <w:spacing w:after="0"/>
+            </w:pPr>
+            <w:r>
+              <w:rPr>
+                <w:sz w:val="20"/>
+                <w:szCs w:val="20"/>
+              </w:rPr>
+              <w:t xml:space="preserve">Pone una invocación (una variante de las plantillas Summon_Base o SummonZone_Base) donde apunta la mira (mantener muestra el marcador en el piso, soltar la pone), a los pies o delante del lanzador, siempre apoyada en el piso. Cobra al ponerla. Lo que la invocación hace (cuánto dura, su zona, su vida) está en su prefab. Ver 7.1.</w:t>
+            </w:r>
+          </w:p>
+        </w:tc>
+        <w:tc>
+          <w:tcPr>
+            <w:tcW w:type="dxa" w:w="2600"/>
+            <w:tcMar>
+              <w:top w:type="dxa" w:w="60"/>
+              <w:left w:type="dxa" w:w="100"/>
+              <w:bottom w:type="dxa" w:w="60"/>
+              <w:right w:type="dxa" w:w="100"/>
+            </w:tcMar>
+          </w:tcPr>
+          <w:p>
+            <w:pPr>
+              <w:spacing w:after="0"/>
+            </w:pPr>
+            <w:r>
+              <w:rPr>
+                <w:rFonts w:ascii="Consolas" w:cs="Consolas" w:eastAsia="Consolas" w:hAnsi="Consolas"/>
+                <w:sz w:val="18"/>
+                <w:szCs w:val="18"/>
+              </w:rPr>
+              <w:t xml:space="preserve">SummonPrefab, Where, MaxRange, MarkerRadius, MaxAlive</w:t>
+            </w:r>
+          </w:p>
+        </w:tc>
+      </w:tr>
+      <w:tr>
+        <w:tc>
+          <w:tcPr>
+            <w:tcW w:type="dxa" w:w="2200"/>
+            <w:tcMar>
+              <w:top w:type="dxa" w:w="60"/>
+              <w:left w:type="dxa" w:w="100"/>
+              <w:bottom w:type="dxa" w:w="60"/>
+              <w:right w:type="dxa" w:w="100"/>
+            </w:tcMar>
+          </w:tcPr>
+          <w:p>
+            <w:pPr>
+              <w:spacing w:after="0"/>
+            </w:pPr>
+            <w:r>
+              <w:rPr>
+                <w:sz w:val="20"/>
+                <w:szCs w:val="20"/>
+              </w:rPr>
               <w:t xml:space="preserve">GA_SelfBuff</w:t>
             </w:r>
           </w:p>
@@ -5930,19 +6002,6 @@
         <w:t xml:space="preserve"> lo instancia como hijo del jugador al equipar la clase y lo destruye al cambiarla, así que su sola presencia ES la pasiva — no hace falta ningún tag.</w:t>
       </w:r>
     </w:p>
-    <w:p>
-      <w:pPr>
-        <w:spacing w:after="120" w:line="276"/>
-      </w:pPr>
-      <w:r>
-        <w:rPr>
-          <w:rFonts w:ascii="Consolas" w:cs="Consolas" w:eastAsia="Consolas" w:hAnsi="Consolas"/>
-          <w:sz w:val="20"/>
-          <w:szCs w:val="20"/>
-        </w:rPr>
-        <w:t xml:space="preserve">Lo que una habilidad DEJA en el mundo (un tótem, una trampa, un muro, un compañero) es una invocación: un prefab con NetworkObject y Entity_Summon (o una subclase), creado con Entity_Summon.Spawn(prefab, dueño, punto, giro). La base ya resuelve el equipo, "Dura", el máximo por dueño (la más vieja se va), qué pasa si el dueño muere, que la vean todos o solo su equipo y, con un AbilitySystemComponent, que tenga vida. Si solo tiene que aplicar algo a los que estén cerca cada tanto (un aura, un muro de fuego), alcanza con Entity_Summon + una Summon_Zone, sin código. Si hace algo propio (saltar al pisarla, perseguir, caminar), una subclase que sobreescriba OnSummoned, Update (llamando a base.Update), OnExpired, OnOwnDeath. Para apoyarla en el piso: Entity_Summon.GroundUnderAim(punto, ojos). La barra de vida es una instancia del prefab Prefabs/UI/Nameplate.</w:t>
-      </w:r>
-    </w:p>
     <w:tbl>
       <w:tblPr>
         <w:tblW w:type="dxa" w:w="9400"/>
@@ -6636,6 +6695,226 @@
           <w:szCs w:val="20"/>
         </w:rPr>
         <w:t xml:space="preserve">Los componentes de pasiva corren en TODOS los peers. Si tu lógica aplica efectos o spawnea cosas, guardala con un chequeo de servidor, igual que una habilidad.</w:t>
+      </w:r>
+    </w:p>
+    <w:p>
+      <w:pPr>
+        <w:pBdr>
+          <w:left w:val="single" w:color="E0A800" w:sz="14" w:space="6"/>
+        </w:pBdr>
+        <w:shd w:fill="FFF6DA" w:val="clear"/>
+        <w:spacing w:after="160" w:before="100"/>
+        <w:ind w:left="144" w:right="144"/>
+      </w:pPr>
+      <w:r>
+        <w:rPr>
+          <w:sz w:val="20"/>
+          <w:szCs w:val="20"/>
+        </w:rPr>
+        <w:t xml:space="preserve">Lo que una habilidad DEJA en el mundo (un tótem, una trampa, un muro, un compañero) es una invocación: un prefab con NetworkObject y Entity_Summon (o una subclase), creado con Entity_Summon.Spawn(prefab, dueño, punto, giro). La base ya resuelve el equipo, "Dura", el máximo por dueño (la más vieja se va), qué pasa si el dueño muere, que la vean todos o solo su equipo y, con un AbilitySystemComponent, que tenga vida. Si solo tiene que aplicar algo a los que estén cerca cada tanto (un aura, un muro de fuego), alcanza con Entity_Summon + una Summon_Zone, sin código. Si hace algo propio (saltar al pisarla, perseguir, caminar), una subclase que sobreescriba OnSummoned, Update (llamando a base.Update), OnExpired, OnOwnDeath. Para apoyarla en el piso: Entity_Summon.GroundUnderAim(punto, ojos). La barra de vida es una instancia del prefab Prefabs/UI/Nameplate.</w:t>
+      </w:r>
+    </w:p>
+    <w:p>
+      <w:pPr>
+        <w:pStyle w:val="Heading2"/>
+        <w:spacing w:after="120" w:before="280"/>
+      </w:pPr>
+      <w:r>
+        <w:rPr>
+          <w:b/>
+          <w:bCs/>
+          <w:color w:val="2E74B5"/>
+          <w:sz w:val="26"/>
+          <w:szCs w:val="26"/>
+        </w:rPr>
+        <w:t xml:space="preserve">7.1 Crear una invocación nueva, paso a paso</w:t>
+      </w:r>
+    </w:p>
+    <w:p>
+      <w:pPr>
+        <w:pBdr>
+          <w:left w:val="single" w:color="E0A800" w:sz="14" w:space="6"/>
+        </w:pBdr>
+        <w:shd w:fill="FFF6DA" w:val="clear"/>
+        <w:spacing w:after="160" w:before="100"/>
+        <w:ind w:left="144" w:right="144"/>
+      </w:pPr>
+      <w:r>
+        <w:rPr>
+          <w:sz w:val="20"/>
+          <w:szCs w:val="20"/>
+        </w:rPr>
+        <w:t xml:space="preserve">Ejemplo de todo el capítulo: un muro de fuego del Mago que quema a los enemigos que lo cruzan. Sin escribir código, mientras la invocación solo tenga que estar ahí y aplicar algo a los que estén cerca.</w:t>
+      </w:r>
+    </w:p>
+    <w:p>
+      <w:pPr>
+        <w:pBdr>
+          <w:left w:val="single" w:color="E0A800" w:sz="14" w:space="6"/>
+        </w:pBdr>
+        <w:shd w:fill="FFF6DA" w:val="clear"/>
+        <w:spacing w:after="160" w:before="100"/>
+        <w:ind w:left="144" w:right="144"/>
+      </w:pPr>
+      <w:r>
+        <w:rPr>
+          <w:sz w:val="20"/>
+          <w:szCs w:val="20"/>
+        </w:rPr>
+        <w:t xml:space="preserve">Paso 1 — Elegir la plantilla. En Prefabs/Summons hay dos: SummonZone_Base, para lo que solo afecta un área (un muro de fuego, una zona de hielo, un aura), y Summon_Base, para lo que se puede golpear (un elemental, un muro que se rompe, un señuelo). Una que se puede golpear y además da un aura (un tótem) sale de Summon_Base con una Summon_Zone agregada.</w:t>
+      </w:r>
+    </w:p>
+    <w:p>
+      <w:pPr>
+        <w:pBdr>
+          <w:left w:val="single" w:color="E0A800" w:sz="14" w:space="6"/>
+        </w:pBdr>
+        <w:shd w:fill="FFF6DA" w:val="clear"/>
+        <w:spacing w:after="160" w:before="100"/>
+        <w:ind w:left="144" w:right="144"/>
+      </w:pPr>
+      <w:r>
+        <w:rPr>
+          <w:sz w:val="20"/>
+          <w:szCs w:val="20"/>
+        </w:rPr>
+        <w:t xml:space="preserve">Paso 2 — Crear la variante. Clic derecho sobre la plantilla ▸ Create ▸ Prefab Variant. Ponerle nombre en inglés (Summon_FireWall) y dejarla en Prefabs/Summons. No se edita la plantilla para una sola invocación: lo que se cambia en la plantilla lo heredan TODAS sus variantes.</w:t>
+      </w:r>
+    </w:p>
+    <w:p>
+      <w:pPr>
+        <w:pBdr>
+          <w:left w:val="single" w:color="E0A800" w:sz="14" w:space="6"/>
+        </w:pBdr>
+        <w:shd w:fill="FFF6DA" w:val="clear"/>
+        <w:spacing w:after="160" w:before="100"/>
+        <w:ind w:left="144" w:right="144"/>
+      </w:pPr>
+      <w:r>
+        <w:rPr>
+          <w:sz w:val="20"/>
+          <w:szCs w:val="20"/>
+        </w:rPr>
+        <w:t xml:space="preserve">Paso 3 — El modelo. Abrir la variante (doble clic) y arrastrar el modelo como hijo de la raíz. En una de Summon_Base, apagar o borrar la cápsula "Modelo" de muestra. En el Entity_Summon, el campo "Modelo" va al modelo nuevo (es lo que se esconde si solo la ve su equipo). Si es más alta o más baja que una persona, subir o bajar la barra de vida (el hijo Nameplate) y ajustar el CapsuleCollider de la raíz. Las piezas del modelo no llevan collider propio.</w:t>
+      </w:r>
+    </w:p>
+    <w:p>
+      <w:pPr>
+        <w:pBdr>
+          <w:left w:val="single" w:color="E0A800" w:sz="14" w:space="6"/>
+        </w:pBdr>
+        <w:shd w:fill="FFF6DA" w:val="clear"/>
+        <w:spacing w:after="160" w:before="100"/>
+        <w:ind w:left="144" w:right="144"/>
+      </w:pPr>
+      <w:r>
+        <w:rPr>
+          <w:sz w:val="20"/>
+          <w:szCs w:val="20"/>
+        </w:rPr>
+        <w:t xml:space="preserve">Paso 4 — La invocación (componente Entity_Summon). "Dura (s)": 0 = hasta que la quiten. "Máximo por dueño": cuántas puede tener uno a la vez; al pasarse, se va la más vieja. "Grupo del límite": vacío = solo las de este prefab. "Si el dueño muere": se queda o desaparece. "La ven": todos, o solo su equipo (invisible para los enemigos, como las trampas). "Recibe zonas": si las auras de otros la alcanzan.</w:t>
+      </w:r>
+    </w:p>
+    <w:p>
+      <w:pPr>
+        <w:pBdr>
+          <w:left w:val="single" w:color="E0A800" w:sz="14" w:space="6"/>
+        </w:pBdr>
+        <w:shd w:fill="FFF6DA" w:val="clear"/>
+        <w:spacing w:after="160" w:before="100"/>
+        <w:ind w:left="144" w:right="144"/>
+      </w:pPr>
+      <w:r>
+        <w:rPr>
+          <w:sz w:val="20"/>
+          <w:szCs w:val="20"/>
+        </w:rPr>
+        <w:t xml:space="preserve">Paso 5 — La zona (componente Summon_Zone), si tiene. "Radio" y "Cada cuánto". "A quién": aliados (y el dueño) o enemigos; "Solo jugadores" si los NPCs no la sienten. "Autor de los efectos": el dueño (escalan con sus stats y la baja es suya: lo normal para el daño) o la invocación (solo si tiene vida; sirve para que un empuje salga desde ella). "Efectos": los GE, que se crean como cualquier otro (Create ▸ GAS ▸ Gameplay Effect, en Effects/ por tipo: la quemadura en Damage). "Potenciada": otros efectos si el dueño tiene un tag. "VFX de la zona": se ve en todas las pantallas mientras está prendida, del tamaño del radio (con VFX_AreaVisual calza exacto). "Empieza prendida" queda en sí; apagada solo si un script la prende (la trampa de espinas al explotar).</w:t>
+      </w:r>
+    </w:p>
+    <w:p>
+      <w:pPr>
+        <w:pBdr>
+          <w:left w:val="single" w:color="E0A800" w:sz="14" w:space="6"/>
+        </w:pBdr>
+        <w:shd w:fill="FFF6DA" w:val="clear"/>
+        <w:spacing w:after="160" w:before="100"/>
+        <w:ind w:left="144" w:right="144"/>
+      </w:pPr>
+      <w:r>
+        <w:rPr>
+          <w:sz w:val="20"/>
+          <w:szCs w:val="20"/>
+        </w:rPr>
+        <w:t xml:space="preserve">Paso 6 — La vida, si sale de Summon_Base. ASDef_SummonBase le da 100 de vida, igual a todas. Para otra vida (o armadura), crear un ASDef propio (Create ▸ GAS ▸ Attribute Set Definition, en Attributes/Summons) y ponerlo en el AbilitySystemComponent de la variante.</w:t>
+      </w:r>
+    </w:p>
+    <w:p>
+      <w:pPr>
+        <w:pBdr>
+          <w:left w:val="single" w:color="E0A800" w:sz="14" w:space="6"/>
+        </w:pBdr>
+        <w:shd w:fill="FFF6DA" w:val="clear"/>
+        <w:spacing w:after="160" w:before="100"/>
+        <w:ind w:left="144" w:right="144"/>
+      </w:pPr>
+      <w:r>
+        <w:rPr>
+          <w:sz w:val="20"/>
+          <w:szCs w:val="20"/>
+        </w:rPr>
+        <w:t xml:space="preserve">Paso 7 — La habilidad que la pone. Create ▸ GAS ▸ Generics ▸ Spawn Summon (GA_SpawnSummon), guardada con las de su clase (GameplayAbilities/&lt;Clase&gt;/). "Prefab de la invocación": la variante. "Dónde": donde apunta (con el marcador en el piso), a los pies o delante del lanzador. "Alcance máximo" y "Máximo a la vez" (0 = el del prefab). Y lo de cualquier habilidad: cooldown, costo, ícono, nombres, clip, "Bloqueada por tags" (aturdido; silencio si es magia) y, si se quiere que tarde en salir, la sección Canalizar.</w:t>
+      </w:r>
+    </w:p>
+    <w:p>
+      <w:pPr>
+        <w:pBdr>
+          <w:left w:val="single" w:color="E0A800" w:sz="14" w:space="6"/>
+        </w:pBdr>
+        <w:shd w:fill="FFF6DA" w:val="clear"/>
+        <w:spacing w:after="160" w:before="100"/>
+        <w:ind w:left="144" w:right="144"/>
+      </w:pPr>
+      <w:r>
+        <w:rPr>
+          <w:sz w:val="20"/>
+          <w:szCs w:val="20"/>
+        </w:rPr>
+        <w:t xml:space="preserve">Paso 8 — Conectarla. Poner la habilidad en la ranura de su clase (Class_*) y correr Mercenarios ▸ Actualizar los registros de red, para la habilidad y los GE nuevos (si no, sus VFX y sus íconos solo se ven en el host). El prefab de la invocación entra solo en la lista de FishNet al guardarlo.</w:t>
+      </w:r>
+    </w:p>
+    <w:p>
+      <w:pPr>
+        <w:pBdr>
+          <w:left w:val="single" w:color="E0A800" w:sz="14" w:space="6"/>
+        </w:pBdr>
+        <w:shd w:fill="FFF6DA" w:val="clear"/>
+        <w:spacing w:after="160" w:before="100"/>
+        <w:ind w:left="144" w:right="144"/>
+      </w:pPr>
+      <w:r>
+        <w:rPr>
+          <w:sz w:val="20"/>
+          <w:szCs w:val="20"/>
+        </w:rPr>
+        <w:t xml:space="preserve">Paso 9 — Probar, con el host y un cliente: que aparezca donde se apuntó y apoyada en el piso (también bajo techo y apuntando a una pared); que la vea quien tiene que verla; que haga su efecto (y que el daño cuente como del dueño: la baja y la definitiva); el máximo a la vez; qué pasa si el dueño muere; y, si tiene vida, que su barra baje al pegarle y que se rompa.</w:t>
+      </w:r>
+    </w:p>
+    <w:p>
+      <w:pPr>
+        <w:pBdr>
+          <w:left w:val="single" w:color="E0A800" w:sz="14" w:space="6"/>
+        </w:pBdr>
+        <w:shd w:fill="FFF6DA" w:val="clear"/>
+        <w:spacing w:after="160" w:before="100"/>
+        <w:ind w:left="144" w:right="144"/>
+      </w:pPr>
+      <w:r>
+        <w:rPr>
+          <w:sz w:val="20"/>
+          <w:szCs w:val="20"/>
+        </w:rPr>
+        <w:t xml:space="preserve">Paso 10 — Si tiene que HACER algo propio (moverse, perseguir, atacar, explotar al pisarla), eso ya es código: una subclase de Entity_Summon, como Entity_Trap o Entity_Companion, que sobreescriba OnSummoned, Update (como override y llamando a base.Update(); si no, la base no corre), OnExpired y OnOwnDeath. La variante cambia su Entity_Summon por la subclase.</w:t>
       </w:r>
     </w:p>
     <w:p>

</xml_diff>